<commit_message>
Updated docs 29th may and added base64
</commit_message>
<xml_diff>
--- a/d2_dart_asynchronous_await_and_future.docx
+++ b/d2_dart_asynchronous_await_and_future.docx
@@ -3761,10 +3761,19 @@
       </w:pPr>
       <w:r>
         <w:rPr>
-          <w:sz w:val="36"/>
-          <w:szCs w:val="36"/>
-        </w:rPr>
-        <w:t xml:space="preserve">Note: If we use </w:t>
+          <w:b/>
+          <w:bCs/>
+          <w:sz w:val="36"/>
+          <w:szCs w:val="36"/>
+        </w:rPr>
+        <w:t>Note:</w:t>
+      </w:r>
+      <w:r>
+        <w:rPr>
+          <w:sz w:val="36"/>
+          <w:szCs w:val="36"/>
+        </w:rPr>
+        <w:t xml:space="preserve"> If we use </w:t>
       </w:r>
       <w:proofErr w:type="spellStart"/>
       <w:r>
@@ -4969,37 +4978,7 @@
           <w:sz w:val="36"/>
           <w:szCs w:val="36"/>
         </w:rPr>
-        <w:t xml:space="preserve">"Executed after </w:t>
-      </w:r>
-      <w:r>
-        <w:rPr>
-          <w:b/>
-          <w:bCs/>
-          <w:color w:val="D86DCB" w:themeColor="accent5" w:themeTint="99"/>
-          <w:sz w:val="36"/>
-          <w:szCs w:val="36"/>
-        </w:rPr>
-        <w:t>3</w:t>
-      </w:r>
-      <w:r>
-        <w:rPr>
-          <w:b/>
-          <w:bCs/>
-          <w:color w:val="D86DCB" w:themeColor="accent5" w:themeTint="99"/>
-          <w:sz w:val="36"/>
-          <w:szCs w:val="36"/>
-        </w:rPr>
-        <w:t xml:space="preserve"> seconds"</w:t>
-      </w:r>
-      <w:r>
-        <w:rPr>
-          <w:b/>
-          <w:bCs/>
-          <w:color w:val="D86DCB" w:themeColor="accent5" w:themeTint="99"/>
-          <w:sz w:val="36"/>
-          <w:szCs w:val="36"/>
-        </w:rPr>
-        <w:t>);</w:t>
+        <w:t>"Executed after 3 seconds");</w:t>
       </w:r>
     </w:p>
     <w:p>

</xml_diff>